<commit_message>
fix(business-plans-en-2): Restaurant y Bakery regenerados con la ronda de arreglos — gates G1-G9 en verde, cifras del caso intactas
astro-site/public/dl/restaurant-business-plan/{restaurant-business-plan.docx,restaurant-financial-projections.xlsx,restaurant-opening-checklist.xlsx}
y astro-site/public/dl/bakery-business-plan/{bakery-business-plan.docx,bakery-financial-projections.xlsx,bakery-opening-checklist.xlsx}
(VPS, sha256 iguales); scripts/productos-digitales/business-plans-en-2/textos_es.json y censo_es.json re-extraídos por
las 5 celdas nuevas de POR_CELDA; textos_en/GREST.json (notas F17/F60 acortadas). Caché numérica y cifras_caso.json
sin cambios; regresión FT/CAF 6/6 idéntica en canónico. §8 en scripts/productos-digitales/business-plans-en-2/F2-NOTAS.md.

Via: Claude Code
Co-Authored-By: Claude Opus 5.5 <noreply@anthropic.com>
Claude-Session: https://claude.ai/code/session_01Hr4gADNsFqH4pKHsfukJDM
</commit_message>
<xml_diff>
--- a/astro-site/public/dl/bakery-business-plan/bakery-business-plan.docx
+++ b/astro-site/public/dl/bakery-business-plan/bakery-business-plan.docx
@@ -654,7 +654,7 @@
     </w:p>
     <w:p>
       <w:r>
-        <w:t>The rest of the investment covers the display case and counter at $9,000, point-of-sale and signage, launch marketing of $4,000 and opening inventory of $3,000. On top of that comes working capital to bridge the gap between paying suppliers and collecting sales, plus a cash reserve for the first months. We fund the project with $70,000 of our own money, or 26% of the cash needed, and a $197,000 bank or SBA 7(a) loan at 10.0% nominal interest over 10 years, with an annual payment of $32,061 (annual equivalent; the lender will set monthly payments). Lenders usually expect an owner equity injection, so we show it clearly. The plan is lender-ready, but approval is never guaranteed, and equipment financing is another route some bakeries use for ovens and mixers.</w:t>
+        <w:t>The rest of the investment covers the display case and counter at $9,000, point-of-sale and signage, launch marketing of $4,000 and opening inventory of $3,000. On top of that comes working capital to bridge the gap between paying suppliers and collecting sales, plus a cash reserve for the first months. We fund the project with $70,000 of our own money, or 26% of the cash needed, and a $197,000 bank or SBA 7(a) loan at 10.0% nominal interest over 10 years, with an annual payment of $32,061 (annual equivalent; the lender will set monthly payments). Lenders usually expect an owner equity injection, so we show it clearly. With an SBA 7(a), the SBA guarantee fee and the closing costs come on top: they change with the loan amount and each fiscal year, so we ask the lender for them and add them to the startup costs. The plan is lender-ready, but approval is never guaranteed, and equipment financing is another route some bakeries use for ovens and mixers.</w:t>
       </w:r>
     </w:p>
     <w:p>
@@ -684,7 +684,7 @@
     </w:p>
     <w:p>
       <w:r>
-        <w:t>Year-1 EBITDA is $91,041, or 14.0% of sales, and the pre-tax result is $51,658. After income tax at an effective 25%, net profit is $38,744 in year 1, $71,907 in year 2 and $92,427 in year 3. Project payback before debt is 2.6 years, and payback on startup costs alone is 1.9 years. In the pessimistic scenario, with 140 transactions a day at $7.64 over 300 days, the pre-tax result is -$155,327 and the estimated year-1 closing cash is -$63,796, so the working capital reserve would run out without corrective action; in the optimistic one, with 233 transactions a day, it is $153,514. The lowest debt service coverage ratio over the loan is 2.44×, against the 1.25× lenders typically look for.</w:t>
+        <w:t>Year-1 EBITDA is $91,041, or 14.0% of sales, and the pre-tax result is $51,658. After income tax at an effective 25% (a C corporation example; pass-through owners set it to 0 and pay tax on the profit personally), net profit is $38,744 in year 1, $71,907 in year 2 and $92,427 in year 3. Project payback before debt is 2.6 years, and payback on startup costs alone is 1.9 years. In the pessimistic scenario, with 140 transactions a day at $7.64 over 300 days, the pre-tax result is -$155,327 and the estimated year-1 closing cash is -$63,796, so the working capital reserve would run out without corrective action; in the optimistic one, with 233 transactions a day at $10.91 over 320 days, it is $153,514. The lowest debt service coverage ratio over the loan is 2.44×, against the 1.25× lenders typically look for.</w:t>
       </w:r>
     </w:p>
     <w:p>
@@ -711,7 +711,7 @@
     </w:p>
     <w:p>
       <w:r>
-        <w:t>Before signing a lease, we confirm with the city that zoning allows a retail bakery or light food production at that address, and once the space passes its final inspections the city issues a certificate of occupancy. A build-out normally needs building permits for construction, electrical, plumbing and mechanical work. The health department reviews the plans for the layout, equipment, sinks and surfaces before construction, then inspects the space before it grants the food establishment permit, so we submit early. Health codes are based on the FDA Food Code, which each state adopts in its own way. Ovens need their own attention: ventilation for the baking area and the gas connection if the ovens run on gas, each with its permits under local code, plus a possible upgrade of the electrical service ($10,000), which is coordinated with the utility. Timelines vary a great deal from one city to the next, so these steps go first on the schedule.</w:t>
+        <w:t>Before signing a lease, we confirm with the city that zoning allows a retail bakery or light food production at that address, and once the space passes its final inspections the city issues a certificate of occupancy. A build-out normally needs building permits for construction, electrical, plumbing and mechanical work, including a grease interceptor where the local plumbing code requires it. The health department reviews the plans for the layout, equipment, sinks and surfaces before construction, then inspects the space before it grants the food establishment permit, so we submit early. Health codes are based on the FDA Food Code, which each state adopts in its own way. Ovens need their own attention: ventilation for the baking area and the gas connection if the ovens run on gas, each with its permits under local code, plus a possible upgrade of the electrical service ($10,000), which is coordinated with the utility. Timelines vary a great deal from one city to the next, so these steps go first on the schedule.</w:t>
       </w:r>
     </w:p>
     <w:p>
@@ -726,7 +726,7 @@
     </w:p>
     <w:p>
       <w:r>
-        <w:t>Insurance and employment complete the legal checklist. We plan on general liability coverage, which landlords usually require, product liability for the food we sell wholesale, property coverage for equipment and stock, and workers' compensation, which is required in almost every state; the workbook budgets insurance at $4,500 a year. As an employer, we follow federal and state rules from the first hire: Form I-9 to verify work eligibility, Form W-4 for withholding, state new-hire reporting and the safety practices OSHA expects, which matter around ovens, heavy lifting and early shifts. Check each requirement with your accountant, an attorney and your local authorities. A note for readers in the United Kingdom: register the food business with your local council at least 28 days before trading, which is free; most cold bread and bakery food to take away is zero-rated for VAT, while food eaten on the premises and hot takeaway food are charged at 20%; expect a hygiene inspection and a Food Hygiene Rating from 1 to 5 in England, Wales and Northern Ireland, and declare the 14 allergens.</w:t>
+        <w:t>Insurance and employment complete the legal checklist. We plan on general liability coverage, which landlords usually require, product liability for the food we sell wholesale, property coverage for equipment and stock, and workers' compensation, which is required in almost every state; the workbook budgets insurance at $4,500 a year. As an employer, we follow federal and state rules from the first hire: Form I-9 to verify work eligibility, Form W-4 for withholding, state new-hire reporting and the safety practices OSHA expects, which matter around ovens, heavy lifting and early shifts. Check each requirement with your accountant, an attorney and your local authorities. A note for readers in the United Kingdom: register the food business with your local council at least 28 days before trading, which is free; most cold bread and bakery food to take away is zero-rated for VAT, while food eaten on the premises and hot takeaway food are charged at 20%; expect a hygiene inspection and a Food Hygiene Rating from 0 to 5 in England, Wales and Northern Ireland (Scotland uses the Food Hygiene Information Scheme), and declare the 14 allergens.</w:t>
       </w:r>
     </w:p>
     <w:p>
@@ -753,7 +753,7 @@
     </w:p>
     <w:p>
       <w:r>
-        <w:t>The business model combines two complementary ways to sell that reduce dependence on a single source of traffic. Direct sales at the counter earn higher margins and put us in direct contact with guests, while wholesale to cafes and restaurants brings steady production volume and lets us plan the day's baking around confirmed orders, which cuts waste. In the workbook both sit in one bakery sales line, so the scenarios move transactions, average check and opening days. That diversification matters most in the first months, when stable cash flow is critical for survival, and the pessimistic case of 140 transactions a day shows how much room we have if the counter builds slowly.</w:t>
+        <w:t>The business model combines two complementary ways to sell that reduce dependence on a single source of traffic. Direct sales at the counter earn higher margins and put us in direct contact with guests, while wholesale to cafes and restaurants brings steady production volume and lets us plan the day's baking around confirmed orders, which cuts waste. In the workbook both sit in one bakery sales line, so the scenarios move transactions, average check and opening days. That diversification matters most in the first months, when stable cash flow is critical for survival, and the pessimistic case of 140 transactions a day shows what happens if the counter builds slowly: without corrective action, the reserve runs out.</w:t>
       </w:r>
     </w:p>
     <w:p>

</xml_diff>